<commit_message>
rebrand website for Hogmall
</commit_message>
<xml_diff>
--- a/src/templates/agent-forms/agency-agreement.docx
+++ b/src/templates/agent-forms/agency-agreement.docx
@@ -12,7 +12,7 @@
           <w:color w:val="2E74B5"/>
           <w:sz w:val="24"/>
         </w:rPr>
-        <w:t>XOGMALL</w:t>
+        <w:t>HOGMALL</w:t>
       </w:r>
     </w:p>
     <w:p>
@@ -94,7 +94,7 @@
               <w:spacing w:after="0"/>
             </w:pPr>
             <w:r>
-              <w:t>Xogmall — legal entity details pending approval</w:t>
+              <w:t>Hogmall — legal entity details pending approval</w:t>
             </w:r>
           </w:p>
         </w:tc>
@@ -246,7 +246,7 @@
         <w:color w:val="5A626E"/>
         <w:sz w:val="16"/>
       </w:rPr>
-      <w:t>Xogmall draft placeholder • approved legal wording and company details required before launch</w:t>
+      <w:t>Hogmall draft placeholder • approved legal wording and company details required before launch</w:t>
     </w:r>
   </w:p>
 </w:ftr>

</xml_diff>